<commit_message>
Update Stage 2 framing in project notes and Oct 7 slides
</commit_message>
<xml_diff>
--- a/Notes/Mina_Project_Notes.docx
+++ b/Notes/Mina_Project_Notes.docx
@@ -262,7 +262,7 @@
         <w:spacing w:after="160"/>
       </w:pPr>
       <w:r>
-        <w:t xml:space="preserve">Two encoders count as aligned to the extent that their representations of the same inputs agree on held-out examples after the composition control; agreement that counts alone reproduce is recorded but not counted. On that definition the pairs fall in the "mixed across pairs" branch of the decision tree (Section 3.2), so each pairing is decided on its own terms. The first fusion models get no explicit alignment loss, since per-sequence alignment never tracks error and most cross-modal agreement is composition. Positional correspondence is used only where the biology supplies it (the shared codon grid on the stability data). The first pairings to fuse are a codon-level RNA encoder with a protein encoder on the stability data, and the transcript and protein with the DNA window on GTEx. Section 10 gives the evidence and the full decision.</w:t>
+        <w:t xml:space="preserve">Alignment has two meanings in this project. Positional alignment, where positions in one input correspond to positions in another, is fixed by the biology: it exists on the stability data, where each codon maps to one amino acid, and not on GTEx. Representational alignment, where two encoders organize the same sequences in the same way, is measured: two encoders count as aligned to the extent that their representations agree on held-out examples after the composition control. Few pairs are aligned on that definition, and alignment never tracks prediction error, so the first fusion models impose only positional alignment (the shared codon grid on the stability data) and get no explicit alignment loss. Stage 2 runs no experiments; its decision sends the project straight into fusion, starting with a codon-level RNA encoder and a protein encoder on the stability data, and the transcript and protein with the DNA window on GTEx. Section 10 gives the evidence and the full decision.</w:t>
       </w:r>
     </w:p>
     <w:p>
@@ -796,7 +796,7 @@
         <w:spacing w:after="160"/>
       </w:pPr>
       <w:r>
-        <w:t xml:space="preserve">Alignment is not treated as solved by resampling sequences to a shared resolution. The project first defines what alignment should mean in the context of biological foundation models, rather than assuming it just means matching sequence lengths. BioLangFusion frames alignment as cross-modal representation alignment, and the lab is running its own study on this question.</w:t>
+        <w:t xml:space="preserve">Alignment is not treated as solved by resampling sequences to a shared resolution. The project defines what alignment should mean for biological foundation models by measuring it on frozen encoders before any fusion model is designed to impose it. It distinguishes two meanings: positional alignment, which the biology fixes (a codon corresponds to one amino acid), and representational alignment, which Stage 1 measures and Stage 2 defines (Section 10). BioLangFusion frames alignment as cross-modal representation alignment, and the lab is running its own study on this question.</w:t>
       </w:r>
     </w:p>
     <w:p>
@@ -1197,7 +1197,7 @@
                 <w:sz w:val="21"/>
                 <w:szCs w:val="21"/>
               </w:rPr>
-              <w:t xml:space="preserve">Decide, based on Stage 1 findings, what a meaningful alignment target looks like for each modality pair and task.</w:t>
+              <w:t xml:space="preserve">Decide, based on Stage 1 findings, what alignment means for each modality pair and whether fusion should enforce it.</w:t>
             </w:r>
           </w:p>
         </w:tc>
@@ -1223,7 +1223,7 @@
                 <w:sz w:val="21"/>
                 <w:szCs w:val="21"/>
               </w:rPr>
-              <w:t xml:space="preserve">A chosen alignment metric and target, plus a judgment on heterogeneity and modality uniqueness.</w:t>
+              <w:t xml:space="preserve">A definition of alignment (positional from the biology, representational as a measurement) and the decision on what the fusion models impose.</w:t>
             </w:r>
           </w:p>
         </w:tc>
@@ -20002,7 +20002,7 @@
         <w:pStyle w:val="Heading1"/>
       </w:pPr>
       <w:r>
-        <w:t xml:space="preserve">10. Stage 2 Decision: Defining Alignment</w:t>
+        <w:t xml:space="preserve">10. Stage 2 Decision: What Alignment Means</w:t>
       </w:r>
     </w:p>
     <w:p>
@@ -20010,7 +20010,7 @@
         <w:spacing w:after="160"/>
       </w:pPr>
       <w:r>
-        <w:t xml:space="preserve">Stage 2 is a decision rather than a computation, so it has no notebook. It is recorded here and in the Overleaf section "Stage 2: Defining Alignment", and any code it calls for is built and tested in Stage 3, since the only meaningful test of an alignment choice is whether fusion improves.</w:t>
+        <w:t xml:space="preserve">Stage 2 is a decision rather than a computation, so it has no notebook and runs no new experiments. It answers one question: what alignment means for DNA, RNA, and protein, and whether the fusion models should enforce it. The answer sends the project straight into Stage 3. The decision is recorded here and in the Overleaf section "Stage 2: What Alignment Means for DNA, RNA, and Protein", and any code it calls for is built and tested in Stage 3, since the only meaningful test of an alignment choice is whether fusion improves.</w:t>
       </w:r>
     </w:p>
     <w:p>
@@ -20018,7 +20018,23 @@
         <w:pStyle w:val="Heading2"/>
       </w:pPr>
       <w:r>
-        <w:t xml:space="preserve">10.1 Working Definition</w:t>
+        <w:t xml:space="preserve">10.1 Why Define Alignment</w:t>
+      </w:r>
+    </w:p>
+    <w:p>
+      <w:pPr>
+        <w:spacing w:after="160"/>
+      </w:pPr>
+      <w:r>
+        <w:t xml:space="preserve">In multimodal learning on video and audio, alignment usually means two things: the modalities share a time axis, so frame t of the video and window t of the audio describe the same moment, and representations of the same moment are trained to coincide, as in contrastive training. For DNA, RNA, and protein it was not obvious that either applies, so Stage 1 measured alignment between frozen encoders before any fusion model was designed to impose it.</w:t>
+      </w:r>
+    </w:p>
+    <w:p>
+      <w:pPr>
+        <w:pStyle w:val="Heading2"/>
+      </w:pPr>
+      <w:r>
+        <w:t xml:space="preserve">10.2 Two Meanings of Alignment</w:t>
       </w:r>
     </w:p>
     <w:p>
@@ -20035,10 +20051,10 @@
           <w:b/>
           <w:bCs/>
         </w:rPr>
-        <w:t xml:space="preserve">Biological correspondence:</w:t>
-      </w:r>
-      <w:r>
-        <w:t xml:space="preserve"> two inputs describe the same molecule or region, such as a coding sequence and its translation, or a transcript and the DNA around its start site. This is fixed by the data, not measured.</w:t>
+        <w:t xml:space="preserve">Positional alignment:</w:t>
+      </w:r>
+      <w:r>
+        <w:t xml:space="preserve"> positions in one input correspond to positions in another. The biology fixes this; no model has to learn it. On the stability data every input derives from one coding sequence, so each codon corresponds to exactly one amino acid and every token stream can be resampled to one codon grid: RNA-FM's three nucleotide vectors per codon are averaged, each six-nucleotide Nucleotide Transformer token spans two codons, byte-pair tokens are split by the nucleotides they cover, and CaLM and the protein encoders already give one token per codon. On GTEx, the DNA window, the transcript, and the protein have no position-by-position correspondence.</w:t>
       </w:r>
     </w:p>
     <w:p>
@@ -20058,7 +20074,7 @@
         <w:t xml:space="preserve">Representational alignment:</w:t>
       </w:r>
       <w:r>
-        <w:t xml:space="preserve"> two encoders' embeddings of corresponding inputs organize the examples in the same way, measured as whole-space similarity (CKA, mutual k-NN, RSA) and as shared directions (held-out CCA and retrieval).</w:t>
+        <w:t xml:space="preserve"> two encoders organize the same examples in the same way, so sequences that are similar in one embedding space are similar in the other, and one encoder's embedding of a sequence can be used to find the other's. Stage 1 measured it as whole-space similarity (CKA, mutual k-NN, RSA) and as shared directions (held-out CCA and retrieval).</w:t>
       </w:r>
     </w:p>
     <w:p>
@@ -20075,10 +20091,18 @@
           <w:b/>
           <w:bCs/>
         </w:rPr>
-        <w:t xml:space="preserve">Predictive complementarity:</w:t>
-      </w:r>
-      <w:r>
-        <w:t xml:space="preserve"> two encoders together predict a target better than the better of the two alone, measured with concatenated linear probes over eleven fold assignments.</w:t>
+        <w:t xml:space="preserve">Predictive complementarity, kept separate:</w:t>
+      </w:r>
+      <w:r>
+        <w:t xml:space="preserve"> two encoders together predict a target better than the better of the two alone, measured with concatenated linear probes over eleven fold assignments. It is not a form of alignment, and Stage 1 shows the two need not coincide.</w:t>
+      </w:r>
+    </w:p>
+    <w:p>
+      <w:pPr>
+        <w:pStyle w:val="Heading2"/>
+      </w:pPr>
+      <w:r>
+        <w:t xml:space="preserve">10.3 Evidence from Stage 1</w:t>
       </w:r>
     </w:p>
     <w:p>
@@ -20095,18 +20119,10 @@
           <w:b/>
           <w:bCs/>
         </w:rPr>
-        <w:t xml:space="preserve">Definition:</w:t>
-      </w:r>
-      <w:r>
-        <w:t xml:space="preserve"> two encoders are aligned to the extent that their representations of corresponding inputs agree on held-out examples after the composition control. Agreement that letter, codon, and amino-acid frequencies reproduce is recorded but not counted as alignment, and alignment is reported separately from complementarity, since Stage 1 shows the two need not coincide. Every fused pair reports CKA and Recall@1 before and after the control, the Mantel test for RSA, and its concatenation gain.</w:t>
-      </w:r>
-    </w:p>
-    <w:p>
-      <w:pPr>
-        <w:pStyle w:val="Heading2"/>
-      </w:pPr>
-      <w:r>
-        <w:t xml:space="preserve">10.2 Evidence from Stage 1</w:t>
+        <w:t xml:space="preserve">Most raw agreement is composition.</w:t>
+      </w:r>
+      <w:r>
+        <w:t xml:space="preserve"> Removing letter, codon, and amino-acid frequencies cuts CKA by 52% to 90% for every pair with a DNA encoder, and Recall@1 for those pairs falls to at most 0.244.</w:t>
       </w:r>
     </w:p>
     <w:p>
@@ -20123,10 +20139,10 @@
           <w:b/>
           <w:bCs/>
         </w:rPr>
-        <w:t xml:space="preserve">Most cross-encoder agreement is composition.</w:t>
-      </w:r>
-      <w:r>
-        <w:t xml:space="preserve"> The control cuts CKA by 52% to 90% for every pair with a DNA encoder; what survives is concentrated in the protein encoders, RNA-FM with RiNALMo, and CaLM with the protein encoders.</w:t>
+        <w:t xml:space="preserve">Few pairs stay aligned after the control.</w:t>
+      </w:r>
+      <w:r>
+        <w:t xml:space="preserve"> The ESM-2 models with each other (Recall@1 0.70 to 0.87), RNA-FM with RiNALMo (0.70), and CaLM with the protein encoders (0.58 to 0.69, about 170 to 200 times the 0.0034 chance level).</w:t>
       </w:r>
     </w:p>
     <w:p>
@@ -20146,7 +20162,7 @@
         <w:t xml:space="preserve">Agreement follows tokenization and training more than modality.</w:t>
       </w:r>
       <w:r>
-        <w:t xml:space="preserve"> RNA-FM and RiNALMo agree at 0.809, the two codon-level encoders at only 0.163.</w:t>
+        <w:t xml:space="preserve"> RNA-FM and RiNALMo agree at CKA 0.809; the two codon-level encoders at only 0.163.</w:t>
       </w:r>
     </w:p>
     <w:p>
@@ -20163,10 +20179,10 @@
           <w:b/>
           <w:bCs/>
         </w:rPr>
-        <w:t xml:space="preserve">Per-sequence alignment does not track prediction error.</w:t>
-      </w:r>
-      <w:r>
-        <w:t xml:space="preserve"> Spearman -0.125 to +0.122 on stability and -0.134 to +0.100 on GTEx, with no pair surviving correction on either dataset.</w:t>
+        <w:t xml:space="preserve">Alignment does not track prediction error.</w:t>
+      </w:r>
+      <w:r>
+        <w:t xml:space="preserve"> Per-sequence alignment against prediction error gives Spearman -0.125 to +0.122 on stability and -0.134 to +0.100 on GTEx, with no pair surviving correction on either dataset.</w:t>
       </w:r>
     </w:p>
     <w:p>
@@ -20183,10 +20199,10 @@
           <w:b/>
           <w:bCs/>
         </w:rPr>
-        <w:t xml:space="preserve">Complementarity exists where alignment is low.</w:t>
-      </w:r>
-      <w:r>
-        <w:t xml:space="preserve"> Every codon-level and protein pairing gains on stability, and on GTEx every DNA encoder gains with every protein and codon-level encoder although their correspondence is near chance.</w:t>
+        <w:t xml:space="preserve">Complementarity appears where alignment is low.</w:t>
+      </w:r>
+      <w:r>
+        <w:t xml:space="preserve"> mRNA-FM with each protein encoder gains under every fold assignment (+0.012 to +0.022) despite low alignment, and on GTEx every DNA encoder gains with every protein encoder although the DNA window almost never retrieves its own protein (Recall@1 at most 0.016). This is the uniqueness regime in which the alignment-theory paper finds that alignment stops predicting performance.</w:t>
       </w:r>
     </w:p>
     <w:p>
@@ -20194,7 +20210,23 @@
         <w:pStyle w:val="Heading2"/>
       </w:pPr>
       <w:r>
-        <w:t xml:space="preserve">10.3 Placement in the Decision Tree</w:t>
+        <w:t xml:space="preserve">10.4 Definition</w:t>
+      </w:r>
+    </w:p>
+    <w:p>
+      <w:pPr>
+        <w:spacing w:after="160"/>
+      </w:pPr>
+      <w:r>
+        <w:t xml:space="preserve">For this project, two encoders are aligned to the extent that their representations of corresponding inputs agree on held-out examples after the composition control. Agreement that letter, codon, and amino-acid frequencies reproduce is recorded but not counted as alignment, and alignment is reported separately from complementarity. Alignment is a measurement reported for each pair, not an objective the fusion models are trained toward.</w:t>
+      </w:r>
+    </w:p>
+    <w:p>
+      <w:pPr>
+        <w:pStyle w:val="Heading2"/>
+      </w:pPr>
+      <w:r>
+        <w:t xml:space="preserve">10.5 Placement in the Decision Tree</w:t>
       </w:r>
     </w:p>
     <w:tbl>
@@ -20906,7 +20938,7 @@
         <w:pStyle w:val="Heading2"/>
       </w:pPr>
       <w:r>
-        <w:t xml:space="preserve">10.4 Decision</w:t>
+        <w:t xml:space="preserve">10.6 Decision</w:t>
       </w:r>
     </w:p>
     <w:p>
@@ -20923,10 +20955,10 @@
           <w:b/>
           <w:bCs/>
         </w:rPr>
-        <w:t xml:space="preserve">No explicit alignment loss in the first fusion models.</w:t>
-      </w:r>
-      <w:r>
-        <w:t xml:space="preserve"> Once composition is removed, every cross-modal pair except CaLM with a protein encoder sits in the low-alignment branch, and for no pair does per-sequence alignment track error, so a contrastive or CCA-style term would mainly pull the representations toward shared composition. The fusion architecture learns any useful interaction. An alignment-loss ablation on CaLM with a protein encoder, the one pair where the moderate-alignment branch could apply, stays a conditional Stage 3 experiment.</w:t>
+        <w:t xml:space="preserve">Impose positional alignment only where the biology supplies it.</w:t>
+      </w:r>
+      <w:r>
+        <w:t xml:space="preserve"> On the stability data, DNA, RNA, and protein token streams are resampled to one codon grid, as in BioLangFusion, which is the step grid Coupled Mamba needs. On GTEx no such grid exists, so fusion there uses cross-attention or pooled representations.</w:t>
       </w:r>
     </w:p>
     <w:p>
@@ -20943,10 +20975,10 @@
           <w:b/>
           <w:bCs/>
         </w:rPr>
-        <w:t xml:space="preserve">Positional correspondence only where the biology supplies it.</w:t>
-      </w:r>
-      <w:r>
-        <w:t xml:space="preserve"> On the stability data, every input derives from one coding sequence, so DNA, RNA, and protein token streams can share one codon grid, as in BioLangFusion, which is the step grid Coupled Mamba needs. On GTEx, the DNA window, transcript, and protein have no position-by-position correspondence, so fusion there uses cross-attention or pooled representations.</w:t>
+        <w:t xml:space="preserve">No explicit alignment loss in the first fusion models.</w:t>
+      </w:r>
+      <w:r>
+        <w:t xml:space="preserve"> They train on the prediction loss alone. A contrastive or CCA-style term would mainly pull the representations toward shared composition, and it could suppress information only one modality carries, such as synonymous codon choice. An alignment-loss ablation on CaLM with a protein encoder, the one cross-modal pair aligned after the control, stays a conditional Stage 3 experiment.</w:t>
       </w:r>
     </w:p>
     <w:p>
@@ -20991,14 +21023,6 @@
     </w:p>
     <w:p>
       <w:pPr>
-        <w:pStyle w:val="Heading2"/>
-      </w:pPr>
-      <w:r>
-        <w:t xml:space="preserve">10.5 Open Items for the Review</w:t>
-      </w:r>
-    </w:p>
-    <w:p>
-      <w:pPr>
         <w:pStyle w:val="ListParagraph"/>
         <w:numPr>
           <w:ilvl w:val="0"/>
@@ -21007,7 +21031,38 @@
         <w:spacing w:after="100"/>
       </w:pPr>
       <w:r>
-        <w:t xml:space="preserve">Whether the agreement that survives the linear composition control is shared information or nonlinear composition; a nonlinear composition model would test this.</w:t>
+        <w:rPr>
+          <w:b/>
+          <w:bCs/>
+        </w:rPr>
+        <w:t xml:space="preserve">Report alignment beside every fusion result.</w:t>
+      </w:r>
+      <w:r>
+        <w:t xml:space="preserve"> Each fused pair reports CKA and Recall@1 before and after the composition control, the Mantel test for RSA, and its concatenation gain, next to its fusion gain.</w:t>
+      </w:r>
+    </w:p>
+    <w:p>
+      <w:pPr>
+        <w:pStyle w:val="Heading2"/>
+      </w:pPr>
+      <w:r>
+        <w:t xml:space="preserve">10.7 What Stage 3 Tests</w:t>
+      </w:r>
+    </w:p>
+    <w:p>
+      <w:pPr>
+        <w:spacing w:after="160"/>
+      </w:pPr>
+      <w:r>
+        <w:t xml:space="preserve">Whether these Stage 1 measurements predict where fusion helps. If alignment and complementarity measured on frozen encoders anticipate fusion gains, they form the project's method for deciding whether and how to fuse before training anything.</w:t>
+      </w:r>
+    </w:p>
+    <w:p>
+      <w:pPr>
+        <w:pStyle w:val="Heading2"/>
+      </w:pPr>
+      <w:r>
+        <w:t xml:space="preserve">10.8 Open Items for the Review</w:t>
       </w:r>
     </w:p>
     <w:p>
@@ -21020,7 +21075,7 @@
         <w:spacing w:after="100"/>
       </w:pPr>
       <w:r>
-        <w:t xml:space="preserve">Whether to keep per-pair decisions, as the decision tree allows, or adopt one fusion design for all three modalities.</w:t>
+        <w:t xml:space="preserve">Whether the agreement that survives the linear composition control is shared information or nonlinear composition; a nonlinear composition model would test this.</w:t>
       </w:r>
     </w:p>
     <w:p>
@@ -21033,23 +21088,7 @@
         <w:spacing w:after="100"/>
       </w:pPr>
       <w:r>
-        <w:t xml:space="preserve">Whether the GTEx length baseline, which matches every encoder combination, should become a required input or control in Stage 3 and Stage 4 comparisons on that task.</w:t>
-      </w:r>
-    </w:p>
-    <w:p>
-      <w:pPr>
-        <w:pStyle w:val="Heading1"/>
-      </w:pPr>
-      <w:r>
-        <w:t xml:space="preserve">11. Next Steps</w:t>
-      </w:r>
-    </w:p>
-    <w:p>
-      <w:pPr>
-        <w:pStyle w:val="Heading3"/>
-      </w:pPr>
-      <w:r>
-        <w:t xml:space="preserve">Setup</w:t>
+        <w:t xml:space="preserve">Whether to keep per-pair decisions, as the decision tree allows, or adopt one fusion design for all three modalities.</w:t>
       </w:r>
     </w:p>
     <w:p>
@@ -21062,7 +21101,23 @@
         <w:spacing w:after="100"/>
       </w:pPr>
       <w:r>
-        <w:t xml:space="preserve">Secure GPU access for Stage 3 training. Google Colab is the fastest path if lab GPU access is not yet set up.</w:t>
+        <w:t xml:space="preserve">Whether the GTEx length baseline, which matches every encoder combination, should become a required input or control in Stage 3 and Stage 4 comparisons on that task.</w:t>
+      </w:r>
+    </w:p>
+    <w:p>
+      <w:pPr>
+        <w:pStyle w:val="Heading1"/>
+      </w:pPr>
+      <w:r>
+        <w:t xml:space="preserve">11. Next Steps</w:t>
+      </w:r>
+    </w:p>
+    <w:p>
+      <w:pPr>
+        <w:pStyle w:val="Heading3"/>
+      </w:pPr>
+      <w:r>
+        <w:t xml:space="preserve">Setup</w:t>
       </w:r>
     </w:p>
     <w:p>
@@ -21075,15 +21130,7 @@
         <w:spacing w:after="100"/>
       </w:pPr>
       <w:r>
-        <w:t xml:space="preserve">Confirm the mRNA_Stability.csv version against the CodonBERT repository and BioLangFusion's filtering (41,123 raw to 23,929 used), and build a deduplicated, sequence-disjoint split.</w:t>
-      </w:r>
-    </w:p>
-    <w:p>
-      <w:pPr>
-        <w:pStyle w:val="Heading3"/>
-      </w:pPr>
-      <w:r>
-        <w:t xml:space="preserve">Stage 3 (Fusion)</w:t>
+        <w:t xml:space="preserve">Secure GPU access for Stage 3 training. Google Colab is the fastest path if lab GPU access is not yet set up.</w:t>
       </w:r>
     </w:p>
     <w:p>
@@ -21096,7 +21143,15 @@
         <w:spacing w:after="100"/>
       </w:pPr>
       <w:r>
-        <w:t xml:space="preserve">Extract token-level embeddings for the selected encoders and, on the stability data, resample the DNA, RNA, and protein token streams to one codon grid.</w:t>
+        <w:t xml:space="preserve">Confirm the mRNA_Stability.csv version against the CodonBERT repository and BioLangFusion's filtering (41,123 raw to 23,929 used), and build a deduplicated, sequence-disjoint split.</w:t>
+      </w:r>
+    </w:p>
+    <w:p>
+      <w:pPr>
+        <w:pStyle w:val="Heading3"/>
+      </w:pPr>
+      <w:r>
+        <w:t xml:space="preserve">Stage 3 (Fusion)</w:t>
       </w:r>
     </w:p>
     <w:p>
@@ -21109,7 +21164,7 @@
         <w:spacing w:after="100"/>
       </w:pPr>
       <w:r>
-        <w:t xml:space="preserve">Run the baselines first for every pairing: the best single encoder, concatenation plus an MLP head, and the Stage 1 linear concatenation on the same folds; on GTEx, also the four length features.</w:t>
+        <w:t xml:space="preserve">Extract token-level embeddings for the selected encoders and, on the stability data, resample the DNA, RNA, and protein token streams to one codon grid.</w:t>
       </w:r>
     </w:p>
     <w:p>
@@ -21122,7 +21177,7 @@
         <w:spacing w:after="100"/>
       </w:pPr>
       <w:r>
-        <w:t xml:space="preserve">Build the Coupled Mamba fusion module first, then Isoformer-style cross-attention: frozen encoders feeding a trainable fusion layer plus a task head, training only the fusion module and head. Start with a codon-level RNA encoder and a protein encoder on stability, and the transcript and protein with the DNA window on GTEx.</w:t>
+        <w:t xml:space="preserve">Run the baselines first for every pairing: the best single encoder, concatenation plus an MLP head, and the Stage 1 linear concatenation on the same folds; on GTEx, also the four length features.</w:t>
       </w:r>
     </w:p>
     <w:p>
@@ -21135,7 +21190,7 @@
         <w:spacing w:after="100"/>
       </w:pPr>
       <w:r>
-        <w:t xml:space="preserve">Run the conditional alignment-loss ablation on CaLM with a protein encoder: the same fusion model trained with and without a contrastive or CCA-style loss.</w:t>
+        <w:t xml:space="preserve">Build the Coupled Mamba fusion module first, then Isoformer-style cross-attention: frozen encoders feeding a trainable fusion layer plus a task head, training only the fusion module and head. Start with a codon-level RNA encoder and a protein encoder on stability, and the transcript and protein with the DNA window on GTEx.</w:t>
       </w:r>
     </w:p>
     <w:p>
@@ -21148,7 +21203,7 @@
         <w:spacing w:after="100"/>
       </w:pPr>
       <w:r>
-        <w:t xml:space="preserve">Build in an Isoformer-style ablation (reinitialize one encoder's weights and confirm performance drops) to show the model genuinely uses cross-modal information rather than leaning on whichever modality is stronger.</w:t>
+        <w:t xml:space="preserve">Run the conditional alignment-loss ablation on CaLM with a protein encoder: the same fusion model trained with and without a contrastive or CCA-style loss.</w:t>
       </w:r>
     </w:p>
     <w:p>
@@ -21161,7 +21216,7 @@
         <w:spacing w:after="100"/>
       </w:pPr>
       <w:r>
-        <w:t xml:space="preserve">Scale up from the pilots to full training sets, since a trained fusion module needs more data than the pilots to find the narrow shared subspace reliably.</w:t>
+        <w:t xml:space="preserve">Build in an Isoformer-style ablation (reinitialize one encoder's weights and confirm performance drops) to show the model genuinely uses cross-modal information rather than leaning on whichever modality is stronger.</w:t>
       </w:r>
     </w:p>
     <w:p>
@@ -21174,15 +21229,7 @@
         <w:spacing w:after="100"/>
       </w:pPr>
       <w:r>
-        <w:t xml:space="preserve">Read each fusion gain against the pair's Stage 1 alignment, before and after the composition control, and its linear concatenation gain, to test whether the Stage 1 measurements predict where fusion helps.</w:t>
-      </w:r>
-    </w:p>
-    <w:p>
-      <w:pPr>
-        <w:pStyle w:val="Heading3"/>
-      </w:pPr>
-      <w:r>
-        <w:t xml:space="preserve">Stage 4 (Benchmarking)</w:t>
+        <w:t xml:space="preserve">Scale up from the pilots to full training sets, since a trained fusion module needs more data than the pilots to find the narrow shared subspace reliably.</w:t>
       </w:r>
     </w:p>
     <w:p>
@@ -21195,7 +21242,15 @@
         <w:spacing w:after="100"/>
       </w:pPr>
       <w:r>
-        <w:t xml:space="preserve">Compare single-modality, pairwise, and three-modality (DNA, RNA, protein) fusion against BioLangFusion's and CodonBERT's published mRNA_Stability scores on the official split and against IsoFormer on GTEx, report leakage-free results on a deduplicated split, and run the mRFP_Expression control.</w:t>
+        <w:t xml:space="preserve">Read each fusion gain against the pair's Stage 1 alignment, before and after the composition control, and its linear concatenation gain, to test whether the Stage 1 measurements predict where fusion helps.</w:t>
+      </w:r>
+    </w:p>
+    <w:p>
+      <w:pPr>
+        <w:pStyle w:val="Heading3"/>
+      </w:pPr>
+      <w:r>
+        <w:t xml:space="preserve">Stage 4 (Benchmarking)</w:t>
       </w:r>
     </w:p>
     <w:p>
@@ -21208,15 +21263,7 @@
         <w:spacing w:after="100"/>
       </w:pPr>
       <w:r>
-        <w:t xml:space="preserve">This is the actual test of the project's premise: does fusion beat the best single-modality model? Everything before this stage is groundwork for answering that question honestly.</w:t>
-      </w:r>
-    </w:p>
-    <w:p>
-      <w:pPr>
-        <w:pStyle w:val="Heading1"/>
-      </w:pPr>
-      <w:r>
-        <w:t xml:space="preserve">12. Open Questions</w:t>
+        <w:t xml:space="preserve">Compare single-modality, pairwise, and three-modality (DNA, RNA, protein) fusion against BioLangFusion's and CodonBERT's published mRNA_Stability scores on the official split and against IsoFormer on GTEx, report leakage-free results on a deduplicated split, and run the mRFP_Expression control.</w:t>
       </w:r>
     </w:p>
     <w:p>
@@ -21229,7 +21276,15 @@
         <w:spacing w:after="100"/>
       </w:pPr>
       <w:r>
-        <w:t>Does mRNA stability become the confirmed Stage 4 benchmark, or one of several alongside IsoFormer's GTEx data? Is the repository's mRNA_Stability.csv the same version BioLangFusion used (Section 4)?</w:t>
+        <w:t xml:space="preserve">This is the actual test of the project's premise: does fusion beat the best single-modality model? Everything before this stage is groundwork for answering that question honestly.</w:t>
+      </w:r>
+    </w:p>
+    <w:p>
+      <w:pPr>
+        <w:pStyle w:val="Heading1"/>
+      </w:pPr>
+      <w:r>
+        <w:t xml:space="preserve">12. Open Questions</w:t>
       </w:r>
     </w:p>
     <w:p>
@@ -21242,7 +21297,7 @@
         <w:spacing w:after="100"/>
       </w:pPr>
       <w:r>
-        <w:t xml:space="preserve">Probe means on the 981-sequence pilot move by up to about 0.02 between fold assignments, so each probe reports pinned folds and the mean over ten further assignments. Should package versions also be pinned, beyond the six pinned model revisions, before comparing encoders across machines?</w:t>
+        <w:t>Does mRNA stability become the confirmed Stage 4 benchmark, or one of several alongside IsoFormer's GTEx data? Is the repository's mRNA_Stability.csv the same version BioLangFusion used (Section 4)?</w:t>
       </w:r>
     </w:p>
     <w:p>
@@ -21255,7 +21310,7 @@
         <w:spacing w:after="100"/>
       </w:pPr>
       <w:r>
-        <w:t xml:space="preserve">Stage 2 decides each pairing on its own terms. Should Stage 3 and Stage 4 report results per pair as well, or converge on one fusion design for all three modalities once the first pairings are tested?</w:t>
+        <w:t xml:space="preserve">Probe means on the 981-sequence pilot move by up to about 0.02 between fold assignments, so each probe reports pinned folds and the mean over ten further assignments. Should package versions also be pinned, beyond the six pinned model revisions, before comparing encoders across machines?</w:t>
       </w:r>
     </w:p>
     <w:p>
@@ -21268,7 +21323,7 @@
         <w:spacing w:after="100"/>
       </w:pPr>
       <w:r>
-        <w:t>Is the small agreement that survives the composition control shared biological information, or nonlinear composition that a linear control cannot remove?</w:t>
+        <w:t xml:space="preserve">Stage 2 decides each pairing on its own terms. Should Stage 3 and Stage 4 report results per pair as well, or converge on one fusion design for all three modalities once the first pairings are tested?</w:t>
       </w:r>
     </w:p>
     <w:p>
@@ -21281,7 +21336,7 @@
         <w:spacing w:after="100"/>
       </w:pPr>
       <w:r>
-        <w:t xml:space="preserve">What do the codon-level encoders carry that the protein encoders lack, and why does CaLM's geometry resemble the protein encoders' while mRNA-FM's diverges in its last layers?</w:t>
+        <w:t>Is the small agreement that survives the composition control shared biological information, or nonlinear composition that a linear control cannot remove?</w:t>
       </w:r>
     </w:p>
     <w:p>
@@ -21294,7 +21349,20 @@
         <w:spacing w:after="100"/>
       </w:pPr>
       <w:r>
-        <w:t xml:space="preserve">Is BioLangFusion's codon-level positional alignment a limitation to design around, or is a learned or contrastive alignment approach preferred if alignment is needed?</w:t>
+        <w:t xml:space="preserve">What do the codon-level encoders carry that the protein encoders lack, and why does CaLM's geometry resemble the protein encoders' while mRNA-FM's diverges in its last layers?</w:t>
+      </w:r>
+    </w:p>
+    <w:p>
+      <w:pPr>
+        <w:pStyle w:val="ListParagraph"/>
+        <w:numPr>
+          <w:ilvl w:val="0"/>
+          <w:numId w:val="2"/>
+        </w:numPr>
+        <w:spacing w:after="100"/>
+      </w:pPr>
+      <w:r>
+        <w:t xml:space="preserve">Stage 2 imposes only positional alignment (the codon grid) and treats representational alignment as a measurement. Does that fit the lab's alignment study, or should a learned or contrastive alignment step be tested more broadly than the CaLM ablation?</w:t>
       </w:r>
     </w:p>
     <w:p>

</xml_diff>